<commit_message>
Update: improved report with additional analysis
</commit_message>
<xml_diff>
--- a/Отчёт_VLM_Проект.docx
+++ b/Отчёт_VLM_Проект.docx
@@ -37,6 +37,13 @@
           <w:lang w:val="ru-RU"/>
         </w:rPr>
         <w:br/>
+      </w:r>
+      <w:r>
+        <w:rPr>
+          <w:color w:val="4FC3F7"/>
+          <w:sz w:val="32"/>
+          <w:lang w:val="ru-RU"/>
+        </w:rPr>
         <w:t>Тонкая настройка визуально-языковой модели</w:t>
       </w:r>
       <w:r>
@@ -90,14 +97,12 @@
         </w:rPr>
         <w:t>-</w:t>
       </w:r>
-      <w:proofErr w:type="spellStart"/>
       <w:r>
         <w:rPr>
           <w:sz w:val="26"/>
         </w:rPr>
         <w:t>ru</w:t>
       </w:r>
-      <w:proofErr w:type="spellEnd"/>
       <w:r>
         <w:rPr>
           <w:sz w:val="26"/>
@@ -105,14 +110,12 @@
         </w:rPr>
         <w:t xml:space="preserve"> · </w:t>
       </w:r>
-      <w:proofErr w:type="spellStart"/>
       <w:r>
         <w:rPr>
           <w:sz w:val="26"/>
         </w:rPr>
         <w:t>MMBench</w:t>
       </w:r>
-      <w:proofErr w:type="spellEnd"/>
       <w:r>
         <w:rPr>
           <w:sz w:val="26"/>
@@ -120,14 +123,12 @@
         </w:rPr>
         <w:t>-</w:t>
       </w:r>
-      <w:proofErr w:type="spellStart"/>
       <w:r>
         <w:rPr>
           <w:sz w:val="26"/>
         </w:rPr>
         <w:t>ru</w:t>
       </w:r>
-      <w:proofErr w:type="spellEnd"/>
       <w:r>
         <w:rPr>
           <w:sz w:val="26"/>
@@ -135,14 +136,12 @@
         </w:rPr>
         <w:t xml:space="preserve"> · </w:t>
       </w:r>
-      <w:proofErr w:type="spellStart"/>
       <w:r>
         <w:rPr>
           <w:sz w:val="26"/>
         </w:rPr>
         <w:t>LLaVA</w:t>
       </w:r>
-      <w:proofErr w:type="spellEnd"/>
       <w:r>
         <w:rPr>
           <w:sz w:val="26"/>
@@ -163,14 +162,12 @@
         </w:rPr>
         <w:t>-</w:t>
       </w:r>
-      <w:proofErr w:type="spellStart"/>
       <w:r>
         <w:rPr>
           <w:sz w:val="26"/>
         </w:rPr>
         <w:t>ru</w:t>
       </w:r>
-      <w:proofErr w:type="spellEnd"/>
       <w:r>
         <w:rPr>
           <w:sz w:val="26"/>
@@ -179,14 +176,12 @@
         <w:br/>
         <w:t xml:space="preserve">Модель: </w:t>
       </w:r>
-      <w:proofErr w:type="spellStart"/>
       <w:r>
         <w:rPr>
           <w:sz w:val="26"/>
         </w:rPr>
         <w:t>deepvk</w:t>
       </w:r>
-      <w:proofErr w:type="spellEnd"/>
       <w:r>
         <w:rPr>
           <w:sz w:val="26"/>
@@ -194,14 +189,12 @@
         </w:rPr>
         <w:t>/</w:t>
       </w:r>
-      <w:proofErr w:type="spellStart"/>
       <w:r>
         <w:rPr>
           <w:sz w:val="26"/>
         </w:rPr>
         <w:t>llava</w:t>
       </w:r>
-      <w:proofErr w:type="spellEnd"/>
       <w:r>
         <w:rPr>
           <w:sz w:val="26"/>
@@ -249,14 +242,12 @@
         <w:br/>
         <w:t xml:space="preserve">Метод: </w:t>
       </w:r>
-      <w:proofErr w:type="spellStart"/>
       <w:r>
         <w:rPr>
           <w:sz w:val="26"/>
         </w:rPr>
         <w:t>QLoRA</w:t>
       </w:r>
-      <w:proofErr w:type="spellEnd"/>
       <w:r>
         <w:rPr>
           <w:sz w:val="26"/>
@@ -290,14 +281,12 @@
         </w:rPr>
         <w:t xml:space="preserve">4 + </w:t>
       </w:r>
-      <w:proofErr w:type="spellStart"/>
       <w:r>
         <w:rPr>
           <w:sz w:val="26"/>
         </w:rPr>
         <w:t>LoRA</w:t>
       </w:r>
-      <w:proofErr w:type="spellEnd"/>
       <w:r>
         <w:rPr>
           <w:sz w:val="26"/>
@@ -416,6 +405,12 @@
     <w:sdt>
       <w:sdtPr>
         <w:rPr>
+          <w:rFonts w:ascii="Calibri" w:eastAsiaTheme="minorEastAsia" w:hAnsi="Calibri" w:cstheme="minorBidi"/>
+          <w:b w:val="0"/>
+          <w:bCs w:val="0"/>
+          <w:color w:val="auto"/>
+          <w:sz w:val="22"/>
+          <w:szCs w:val="22"/>
           <w:lang w:val="ru-RU"/>
         </w:rPr>
         <w:id w:val="591286324"/>
@@ -426,10 +421,6 @@
       </w:sdtPr>
       <w:sdtEndPr>
         <w:rPr>
-          <w:rFonts w:ascii="Calibri" w:eastAsiaTheme="minorEastAsia" w:hAnsi="Calibri" w:cstheme="minorBidi"/>
-          <w:color w:val="auto"/>
-          <w:sz w:val="22"/>
-          <w:szCs w:val="22"/>
           <w:lang w:val="en-US"/>
         </w:rPr>
       </w:sdtEndPr>
@@ -3838,11 +3829,9 @@
         </w:rPr>
         <w:t xml:space="preserve"> (через команду </w:t>
       </w:r>
-      <w:proofErr w:type="spellStart"/>
       <w:r>
         <w:t>DeepVK</w:t>
       </w:r>
-      <w:proofErr w:type="spellEnd"/>
       <w:r>
         <w:rPr>
           <w:lang w:val="ru-RU"/>
@@ -3885,44 +3874,36 @@
         </w:rPr>
         <w:t>-</w:t>
       </w:r>
-      <w:proofErr w:type="spellStart"/>
       <w:r>
         <w:t>ru</w:t>
       </w:r>
-      <w:proofErr w:type="spellEnd"/>
       <w:r>
         <w:rPr>
           <w:lang w:val="ru-RU"/>
         </w:rPr>
         <w:t xml:space="preserve">, </w:t>
       </w:r>
-      <w:proofErr w:type="spellStart"/>
       <w:r>
         <w:t>MMBench</w:t>
       </w:r>
-      <w:proofErr w:type="spellEnd"/>
       <w:r>
         <w:rPr>
           <w:lang w:val="ru-RU"/>
         </w:rPr>
         <w:t>-</w:t>
       </w:r>
-      <w:proofErr w:type="spellStart"/>
       <w:r>
         <w:t>ru</w:t>
       </w:r>
-      <w:proofErr w:type="spellEnd"/>
       <w:r>
         <w:rPr>
           <w:lang w:val="ru-RU"/>
         </w:rPr>
         <w:t xml:space="preserve"> и инструкционный датасет </w:t>
       </w:r>
-      <w:proofErr w:type="spellStart"/>
       <w:r>
         <w:t>LLaVA</w:t>
       </w:r>
-      <w:proofErr w:type="spellEnd"/>
       <w:r>
         <w:rPr>
           <w:lang w:val="ru-RU"/>
@@ -3938,22 +3919,18 @@
         </w:rPr>
         <w:t>-</w:t>
       </w:r>
-      <w:proofErr w:type="spellStart"/>
       <w:r>
         <w:t>ru</w:t>
       </w:r>
-      <w:proofErr w:type="spellEnd"/>
       <w:r>
         <w:rPr>
           <w:lang w:val="ru-RU"/>
         </w:rPr>
         <w:t xml:space="preserve">, а также модель </w:t>
       </w:r>
-      <w:proofErr w:type="spellStart"/>
       <w:r>
         <w:t>llava</w:t>
       </w:r>
-      <w:proofErr w:type="spellEnd"/>
       <w:r>
         <w:rPr>
           <w:lang w:val="ru-RU"/>
@@ -4057,11 +4034,9 @@
           <w:lang w:val="ru-RU"/>
         </w:rPr>
       </w:pPr>
-      <w:proofErr w:type="spellStart"/>
       <w:r>
         <w:t>QLoRA</w:t>
       </w:r>
-      <w:proofErr w:type="spellEnd"/>
       <w:r>
         <w:rPr>
           <w:lang w:val="ru-RU"/>
@@ -4192,14 +4167,12 @@
         </w:rPr>
         <w:t>-</w:t>
       </w:r>
-      <w:proofErr w:type="spellStart"/>
       <w:r>
         <w:rPr>
           <w:b/>
         </w:rPr>
         <w:t>ru</w:t>
       </w:r>
-      <w:proofErr w:type="spellEnd"/>
       <w:r>
         <w:rPr>
           <w:b/>
@@ -4207,14 +4180,12 @@
         </w:rPr>
         <w:t xml:space="preserve"> и </w:t>
       </w:r>
-      <w:proofErr w:type="spellStart"/>
       <w:r>
         <w:rPr>
           <w:b/>
         </w:rPr>
         <w:t>MMBench</w:t>
       </w:r>
-      <w:proofErr w:type="spellEnd"/>
       <w:r>
         <w:rPr>
           <w:b/>
@@ -4222,14 +4193,12 @@
         </w:rPr>
         <w:t>-</w:t>
       </w:r>
-      <w:proofErr w:type="spellStart"/>
       <w:r>
         <w:rPr>
           <w:b/>
         </w:rPr>
         <w:t>ru</w:t>
       </w:r>
-      <w:proofErr w:type="spellEnd"/>
       <w:r>
         <w:rPr>
           <w:b/>
@@ -4237,14 +4206,12 @@
         </w:rPr>
         <w:t xml:space="preserve"> путём </w:t>
       </w:r>
-      <w:proofErr w:type="spellStart"/>
       <w:r>
         <w:rPr>
           <w:b/>
         </w:rPr>
         <w:t>QLoRA</w:t>
       </w:r>
-      <w:proofErr w:type="spellEnd"/>
       <w:r>
         <w:rPr>
           <w:b/>
@@ -4278,14 +4245,12 @@
         </w:rPr>
         <w:t xml:space="preserve"> модели </w:t>
       </w:r>
-      <w:proofErr w:type="spellStart"/>
       <w:r>
         <w:rPr>
           <w:b/>
         </w:rPr>
         <w:t>deepvk</w:t>
       </w:r>
-      <w:proofErr w:type="spellEnd"/>
       <w:r>
         <w:rPr>
           <w:b/>
@@ -4293,14 +4258,12 @@
         </w:rPr>
         <w:t>/</w:t>
       </w:r>
-      <w:proofErr w:type="spellStart"/>
       <w:r>
         <w:rPr>
           <w:b/>
         </w:rPr>
         <w:t>llava</w:t>
       </w:r>
-      <w:proofErr w:type="spellEnd"/>
       <w:r>
         <w:rPr>
           <w:b/>
@@ -4408,44 +4371,36 @@
         </w:rPr>
         <w:t>-</w:t>
       </w:r>
-      <w:proofErr w:type="spellStart"/>
       <w:r>
         <w:t>ru</w:t>
       </w:r>
-      <w:proofErr w:type="spellEnd"/>
       <w:r>
         <w:rPr>
           <w:lang w:val="ru-RU"/>
         </w:rPr>
         <w:t xml:space="preserve">, </w:t>
       </w:r>
-      <w:proofErr w:type="spellStart"/>
       <w:r>
         <w:t>MMBench</w:t>
       </w:r>
-      <w:proofErr w:type="spellEnd"/>
       <w:r>
         <w:rPr>
           <w:lang w:val="ru-RU"/>
         </w:rPr>
         <w:t>-</w:t>
       </w:r>
-      <w:proofErr w:type="spellStart"/>
       <w:r>
         <w:t>ru</w:t>
       </w:r>
-      <w:proofErr w:type="spellEnd"/>
       <w:r>
         <w:rPr>
           <w:lang w:val="ru-RU"/>
         </w:rPr>
         <w:t xml:space="preserve"> и </w:t>
       </w:r>
-      <w:proofErr w:type="spellStart"/>
       <w:r>
         <w:t>LLaVA</w:t>
       </w:r>
-      <w:proofErr w:type="spellEnd"/>
       <w:r>
         <w:rPr>
           <w:lang w:val="ru-RU"/>
@@ -4461,11 +4416,9 @@
         </w:rPr>
         <w:t>-</w:t>
       </w:r>
-      <w:proofErr w:type="spellStart"/>
       <w:r>
         <w:t>ru</w:t>
       </w:r>
-      <w:proofErr w:type="spellEnd"/>
     </w:p>
     <w:p>
       <w:pPr>
@@ -4488,11 +4441,9 @@
         </w:rPr>
         <w:t>-</w:t>
       </w:r>
-      <w:proofErr w:type="spellStart"/>
       <w:r>
         <w:t>ru</w:t>
       </w:r>
-      <w:proofErr w:type="spellEnd"/>
       <w:r>
         <w:rPr>
           <w:lang w:val="ru-RU"/>
@@ -4539,11 +4490,9 @@
         </w:rPr>
         <w:t xml:space="preserve">3. Выполнить </w:t>
       </w:r>
-      <w:proofErr w:type="spellStart"/>
       <w:r>
         <w:t>QLoRA</w:t>
       </w:r>
-      <w:proofErr w:type="spellEnd"/>
       <w:r>
         <w:rPr>
           <w:lang w:val="ru-RU"/>
@@ -4608,33 +4557,27 @@
         </w:rPr>
         <w:t>-</w:t>
       </w:r>
-      <w:proofErr w:type="spellStart"/>
       <w:r>
         <w:t>ru</w:t>
       </w:r>
-      <w:proofErr w:type="spellEnd"/>
       <w:r>
         <w:rPr>
           <w:lang w:val="ru-RU"/>
         </w:rPr>
         <w:t xml:space="preserve"> и </w:t>
       </w:r>
-      <w:proofErr w:type="spellStart"/>
       <w:r>
         <w:t>MMBench</w:t>
       </w:r>
-      <w:proofErr w:type="spellEnd"/>
       <w:r>
         <w:rPr>
           <w:lang w:val="ru-RU"/>
         </w:rPr>
         <w:t>-</w:t>
       </w:r>
-      <w:proofErr w:type="spellStart"/>
       <w:r>
         <w:t>ru</w:t>
       </w:r>
-      <w:proofErr w:type="spellEnd"/>
       <w:r>
         <w:rPr>
           <w:lang w:val="ru-RU"/>
@@ -4673,30 +4616,14 @@
         <w:pStyle w:val="21"/>
       </w:pPr>
       <w:bookmarkStart w:id="4" w:name="_Toc235147376"/>
-      <w:proofErr w:type="spellStart"/>
       <w:r>
         <w:rPr>
           <w:color w:val="007BFF"/>
         </w:rPr>
         <w:lastRenderedPageBreak/>
-        <w:t>Ожидаемые</w:t>
-      </w:r>
-      <w:proofErr w:type="spellEnd"/>
-      <w:r>
-        <w:rPr>
-          <w:color w:val="007BFF"/>
-        </w:rPr>
-        <w:t xml:space="preserve"> </w:t>
-      </w:r>
-      <w:proofErr w:type="spellStart"/>
-      <w:r>
-        <w:rPr>
-          <w:color w:val="007BFF"/>
-        </w:rPr>
-        <w:t>результаты</w:t>
+        <w:t>Ожидаемые результаты</w:t>
       </w:r>
       <w:bookmarkEnd w:id="4"/>
-      <w:proofErr w:type="spellEnd"/>
     </w:p>
     <w:tbl>
       <w:tblPr>
@@ -4788,30 +4715,8 @@
               <w:rPr>
                 <w:sz w:val="20"/>
               </w:rPr>
-              <w:t xml:space="preserve">eda.py, </w:t>
-            </w:r>
-            <w:proofErr w:type="spellStart"/>
-            <w:r>
-              <w:rPr>
-                <w:sz w:val="20"/>
-              </w:rPr>
-              <w:t>eda_output</w:t>
-            </w:r>
-            <w:proofErr w:type="spellEnd"/>
-            <w:r>
-              <w:rPr>
-                <w:sz w:val="20"/>
-              </w:rPr>
-              <w:t>/</w:t>
-            </w:r>
-            <w:proofErr w:type="spellStart"/>
-            <w:r>
-              <w:rPr>
-                <w:sz w:val="20"/>
-              </w:rPr>
-              <w:t>eda_summary.json</w:t>
-            </w:r>
-            <w:proofErr w:type="spellEnd"/>
+              <w:t>eda.py, eda_output/eda_summary.json</w:t>
+            </w:r>
           </w:p>
         </w:tc>
       </w:tr>
@@ -5010,7 +4915,7 @@
               <w:rPr>
                 <w:sz w:val="20"/>
               </w:rPr>
-              <w:t>Презентация</w:t>
+              <w:t>Данный отчёт</w:t>
             </w:r>
           </w:p>
         </w:tc>
@@ -5021,42 +4926,6 @@
           <w:p>
             <w:pPr>
               <w:cnfStyle w:val="000000100000" w:firstRow="0" w:lastRow="0" w:firstColumn="0" w:lastColumn="0" w:oddVBand="0" w:evenVBand="0" w:oddHBand="1" w:evenHBand="0" w:firstRowFirstColumn="0" w:firstRowLastColumn="0" w:lastRowFirstColumn="0" w:lastRowLastColumn="0"/>
-            </w:pPr>
-            <w:r>
-              <w:rPr>
-                <w:sz w:val="20"/>
-              </w:rPr>
-              <w:t>presentation/VLM_Project_Presentation.pptx</w:t>
-            </w:r>
-          </w:p>
-        </w:tc>
-      </w:tr>
-      <w:tr>
-        <w:trPr>
-          <w:cnfStyle w:val="000000010000" w:firstRow="0" w:lastRow="0" w:firstColumn="0" w:lastColumn="0" w:oddVBand="0" w:evenVBand="0" w:oddHBand="0" w:evenHBand="1" w:firstRowFirstColumn="0" w:firstRowLastColumn="0" w:lastRowFirstColumn="0" w:lastRowLastColumn="0"/>
-          <w:jc w:val="center"/>
-        </w:trPr>
-        <w:tc>
-          <w:tcPr>
-            <w:cnfStyle w:val="001000000000" w:firstRow="0" w:lastRow="0" w:firstColumn="1" w:lastColumn="0" w:oddVBand="0" w:evenVBand="0" w:oddHBand="0" w:evenHBand="0" w:firstRowFirstColumn="0" w:firstRowLastColumn="0" w:lastRowFirstColumn="0" w:lastRowLastColumn="0"/>
-            <w:tcW w:w="4320" w:type="dxa"/>
-          </w:tcPr>
-          <w:p>
-            <w:r>
-              <w:rPr>
-                <w:sz w:val="20"/>
-              </w:rPr>
-              <w:t>Данный отчёт</w:t>
-            </w:r>
-          </w:p>
-        </w:tc>
-        <w:tc>
-          <w:tcPr>
-            <w:tcW w:w="4320" w:type="dxa"/>
-          </w:tcPr>
-          <w:p>
-            <w:pPr>
-              <w:cnfStyle w:val="000000010000" w:firstRow="0" w:lastRow="0" w:firstColumn="0" w:lastColumn="0" w:oddVBand="0" w:evenVBand="0" w:oddHBand="0" w:evenHBand="1" w:firstRowFirstColumn="0" w:firstRowLastColumn="0" w:lastRowFirstColumn="0" w:lastRowLastColumn="0"/>
             </w:pPr>
             <w:r>
               <w:rPr>
@@ -5555,11 +5424,9 @@
         </w:rPr>
         <w:t>-</w:t>
       </w:r>
-      <w:proofErr w:type="spellStart"/>
       <w:r>
         <w:t>ru</w:t>
       </w:r>
-      <w:proofErr w:type="spellEnd"/>
       <w:r>
         <w:rPr>
           <w:lang w:val="ru-RU"/>
@@ -5650,11 +5517,9 @@
         </w:rPr>
         <w:t xml:space="preserve"> строк, текстовые инструкции без изображений) и </w:t>
       </w:r>
-      <w:proofErr w:type="spellStart"/>
       <w:r>
         <w:t>testdev</w:t>
       </w:r>
-      <w:proofErr w:type="spellEnd"/>
       <w:r>
         <w:rPr>
           <w:lang w:val="ru-RU"/>
@@ -5688,11 +5553,9 @@
         </w:rPr>
         <w:t xml:space="preserve"> строк, вопросы и ответы), а также </w:t>
       </w:r>
-      <w:proofErr w:type="spellStart"/>
       <w:r>
         <w:t>testdev</w:t>
       </w:r>
-      <w:proofErr w:type="spellEnd"/>
       <w:r>
         <w:rPr>
           <w:lang w:val="ru-RU"/>
@@ -5719,29 +5582,8 @@
       </w:r>
     </w:p>
     <w:p>
-      <w:proofErr w:type="spellStart"/>
-      <w:r>
-        <w:t>Поля</w:t>
-      </w:r>
-      <w:proofErr w:type="spellEnd"/>
-      <w:r>
-        <w:t xml:space="preserve"> </w:t>
-      </w:r>
-      <w:proofErr w:type="spellStart"/>
-      <w:r>
-        <w:t>датасета</w:t>
-      </w:r>
-      <w:proofErr w:type="spellEnd"/>
-      <w:r>
-        <w:t xml:space="preserve">: id, </w:t>
-      </w:r>
-      <w:proofErr w:type="spellStart"/>
-      <w:r>
-        <w:t>imageId</w:t>
-      </w:r>
-      <w:proofErr w:type="spellEnd"/>
-      <w:r>
-        <w:t>, question, answer, fullAnswer, isBalanced, groups, entailed, equivalent, types, annotations, semantic, semanticStr</w:t>
+      <w:r>
+        <w:t>Поля датасета: id, imageId, question, answer, fullAnswer, isBalanced, groups, entailed, equivalent, types, annotations, semantic, semanticStr</w:t>
       </w:r>
     </w:p>
     <w:p>
@@ -5764,14 +5606,12 @@
         </w:rPr>
         <w:t xml:space="preserve">3.2. </w:t>
       </w:r>
-      <w:proofErr w:type="spellStart"/>
       <w:r>
         <w:rPr>
           <w:color w:val="007BFF"/>
         </w:rPr>
         <w:t>MMBench</w:t>
       </w:r>
-      <w:proofErr w:type="spellEnd"/>
       <w:r>
         <w:rPr>
           <w:color w:val="007BFF"/>
@@ -5779,7 +5619,6 @@
         </w:rPr>
         <w:t>-</w:t>
       </w:r>
-      <w:proofErr w:type="spellStart"/>
       <w:r>
         <w:rPr>
           <w:color w:val="007BFF"/>
@@ -5787,7 +5626,6 @@
         <w:t>ru</w:t>
       </w:r>
       <w:bookmarkEnd w:id="7"/>
-      <w:proofErr w:type="spellEnd"/>
     </w:p>
     <w:p>
       <w:pPr>
@@ -5795,22 +5633,18 @@
           <w:lang w:val="ru-RU"/>
         </w:rPr>
       </w:pPr>
-      <w:proofErr w:type="spellStart"/>
       <w:r>
         <w:t>MMBench</w:t>
       </w:r>
-      <w:proofErr w:type="spellEnd"/>
       <w:r>
         <w:rPr>
           <w:lang w:val="ru-RU"/>
         </w:rPr>
         <w:t>-</w:t>
       </w:r>
-      <w:proofErr w:type="spellStart"/>
       <w:r>
         <w:t>ru</w:t>
       </w:r>
-      <w:proofErr w:type="spellEnd"/>
       <w:r>
         <w:rPr>
           <w:lang w:val="ru-RU"/>
@@ -5829,11 +5663,9 @@
         </w:rPr>
         <w:t xml:space="preserve"> переведённый бенчмарк </w:t>
       </w:r>
-      <w:proofErr w:type="spellStart"/>
       <w:r>
         <w:t>MMBench</w:t>
       </w:r>
-      <w:proofErr w:type="spellEnd"/>
       <w:r>
         <w:rPr>
           <w:lang w:val="ru-RU"/>
@@ -5989,14 +5821,12 @@
         </w:rPr>
         <w:t xml:space="preserve">3.3. </w:t>
       </w:r>
-      <w:proofErr w:type="spellStart"/>
       <w:r>
         <w:rPr>
           <w:color w:val="007BFF"/>
         </w:rPr>
         <w:t>LLaVA</w:t>
       </w:r>
-      <w:proofErr w:type="spellEnd"/>
       <w:r>
         <w:rPr>
           <w:color w:val="007BFF"/>
@@ -6017,7 +5847,6 @@
         </w:rPr>
         <w:t>-</w:t>
       </w:r>
-      <w:proofErr w:type="spellStart"/>
       <w:r>
         <w:rPr>
           <w:color w:val="007BFF"/>
@@ -6025,7 +5854,6 @@
         <w:t>ru</w:t>
       </w:r>
       <w:bookmarkEnd w:id="8"/>
-      <w:proofErr w:type="spellEnd"/>
     </w:p>
     <w:p>
       <w:pPr>
@@ -6033,11 +5861,9 @@
           <w:lang w:val="ru-RU"/>
         </w:rPr>
       </w:pPr>
-      <w:proofErr w:type="spellStart"/>
       <w:r>
         <w:t>LLaVA</w:t>
       </w:r>
-      <w:proofErr w:type="spellEnd"/>
       <w:r>
         <w:rPr>
           <w:lang w:val="ru-RU"/>
@@ -6053,11 +5879,9 @@
         </w:rPr>
         <w:t>-</w:t>
       </w:r>
-      <w:proofErr w:type="spellStart"/>
       <w:r>
         <w:t>ru</w:t>
       </w:r>
-      <w:proofErr w:type="spellEnd"/>
       <w:r>
         <w:rPr>
           <w:lang w:val="ru-RU"/>
@@ -6085,11 +5909,9 @@
         </w:rPr>
         <w:t xml:space="preserve"> для </w:t>
       </w:r>
-      <w:proofErr w:type="spellStart"/>
       <w:r>
         <w:t>LLaVA</w:t>
       </w:r>
-      <w:proofErr w:type="spellEnd"/>
       <w:r>
         <w:rPr>
           <w:lang w:val="ru-RU"/>
@@ -6147,22 +5969,18 @@
           <w:lang w:val="ru-RU"/>
         </w:rPr>
       </w:pPr>
-      <w:proofErr w:type="spellStart"/>
       <w:r>
         <w:t>deepvk</w:t>
       </w:r>
-      <w:proofErr w:type="spellEnd"/>
       <w:r>
         <w:rPr>
           <w:lang w:val="ru-RU"/>
         </w:rPr>
         <w:t>/</w:t>
       </w:r>
-      <w:proofErr w:type="spellStart"/>
       <w:r>
         <w:t>llava</w:t>
       </w:r>
-      <w:proofErr w:type="spellEnd"/>
       <w:r>
         <w:rPr>
           <w:lang w:val="ru-RU"/>
@@ -6208,11 +6026,9 @@
         </w:rPr>
         <w:t xml:space="preserve"> визуально-языковая модель на основе архитектуры </w:t>
       </w:r>
-      <w:proofErr w:type="spellStart"/>
       <w:r>
         <w:t>LLaVA</w:t>
       </w:r>
-      <w:proofErr w:type="spellEnd"/>
       <w:r>
         <w:rPr>
           <w:lang w:val="ru-RU"/>
@@ -6237,11 +6053,9 @@
         </w:rPr>
         <w:t xml:space="preserve"> </w:t>
       </w:r>
-      <w:proofErr w:type="spellStart"/>
       <w:r>
         <w:t>SigLIP</w:t>
       </w:r>
-      <w:proofErr w:type="spellEnd"/>
       <w:r>
         <w:rPr>
           <w:lang w:val="ru-RU"/>
@@ -6291,11 +6105,9 @@
         <w:lastRenderedPageBreak/>
         <w:t xml:space="preserve">параметров, уже использует </w:t>
       </w:r>
-      <w:proofErr w:type="spellStart"/>
       <w:r>
         <w:t>LoRA</w:t>
       </w:r>
-      <w:proofErr w:type="spellEnd"/>
       <w:r>
         <w:rPr>
           <w:lang w:val="ru-RU"/>
@@ -6320,11 +6132,9 @@
         </w:rPr>
         <w:t>/</w:t>
       </w:r>
-      <w:proofErr w:type="spellStart"/>
       <w:r>
         <w:t>llava</w:t>
       </w:r>
-      <w:proofErr w:type="spellEnd"/>
       <w:r>
         <w:rPr>
           <w:lang w:val="ru-RU"/>
@@ -6433,11 +6243,9 @@
         </w:rPr>
         <w:t xml:space="preserve">-режима </w:t>
       </w:r>
-      <w:proofErr w:type="spellStart"/>
       <w:r>
         <w:t>HuggingFace</w:t>
       </w:r>
-      <w:proofErr w:type="spellEnd"/>
       <w:r>
         <w:rPr>
           <w:lang w:val="ru-RU"/>
@@ -6453,11 +6261,9 @@
         </w:rPr>
         <w:t xml:space="preserve"> (для экономии памяти). Результаты сохранены в </w:t>
       </w:r>
-      <w:proofErr w:type="spellStart"/>
       <w:r>
         <w:t>eda</w:t>
       </w:r>
-      <w:proofErr w:type="spellEnd"/>
       <w:r>
         <w:rPr>
           <w:lang w:val="ru-RU"/>
@@ -6473,11 +6279,9 @@
         </w:rPr>
         <w:t>/</w:t>
       </w:r>
-      <w:proofErr w:type="spellStart"/>
       <w:r>
         <w:t>eda</w:t>
       </w:r>
-      <w:proofErr w:type="spellEnd"/>
       <w:r>
         <w:rPr>
           <w:lang w:val="ru-RU"/>
@@ -6493,11 +6297,9 @@
         </w:rPr>
         <w:t>.</w:t>
       </w:r>
-      <w:proofErr w:type="spellStart"/>
       <w:r>
         <w:t>json</w:t>
       </w:r>
-      <w:proofErr w:type="spellEnd"/>
       <w:r>
         <w:rPr>
           <w:lang w:val="ru-RU"/>
@@ -6533,14 +6335,12 @@
         </w:rPr>
         <w:t>-</w:t>
       </w:r>
-      <w:proofErr w:type="spellStart"/>
       <w:r>
         <w:rPr>
           <w:color w:val="007BFF"/>
         </w:rPr>
         <w:t>ru</w:t>
       </w:r>
-      <w:proofErr w:type="spellEnd"/>
       <w:r>
         <w:rPr>
           <w:color w:val="007BFF"/>
@@ -6613,11 +6413,9 @@
         </w:rPr>
         <w:t>-</w:t>
       </w:r>
-      <w:proofErr w:type="spellStart"/>
       <w:r>
         <w:t>ru</w:t>
       </w:r>
-      <w:proofErr w:type="spellEnd"/>
       <w:r>
         <w:rPr>
           <w:lang w:val="ru-RU"/>
@@ -7109,11 +6907,9 @@
           <w:lang w:val="ru-RU"/>
         </w:rPr>
       </w:pPr>
-      <w:proofErr w:type="spellStart"/>
       <w:r>
         <w:t>QLoRA</w:t>
       </w:r>
-      <w:proofErr w:type="spellEnd"/>
       <w:r>
         <w:rPr>
           <w:lang w:val="ru-RU"/>
@@ -7259,11 +7055,9 @@
         </w:rPr>
         <w:t xml:space="preserve">Эффективность: </w:t>
       </w:r>
-      <w:proofErr w:type="spellStart"/>
       <w:r>
         <w:t>QLoRA</w:t>
       </w:r>
-      <w:proofErr w:type="spellEnd"/>
       <w:r>
         <w:rPr>
           <w:lang w:val="ru-RU"/>
@@ -7279,11 +7073,9 @@
         </w:rPr>
         <w:t xml:space="preserve">4) и обучает только </w:t>
       </w:r>
-      <w:proofErr w:type="spellStart"/>
       <w:r>
         <w:t>LoRA</w:t>
       </w:r>
-      <w:proofErr w:type="spellEnd"/>
       <w:r>
         <w:rPr>
           <w:lang w:val="ru-RU"/>
@@ -7304,11 +7096,9 @@
         </w:rPr>
         <w:t xml:space="preserve">Качество: исследования показывают, что </w:t>
       </w:r>
-      <w:proofErr w:type="spellStart"/>
       <w:r>
         <w:t>QLoRA</w:t>
       </w:r>
-      <w:proofErr w:type="spellEnd"/>
       <w:r>
         <w:rPr>
           <w:lang w:val="ru-RU"/>
@@ -7341,11 +7131,9 @@
         </w:rPr>
         <w:t xml:space="preserve">Совместимость: модель </w:t>
       </w:r>
-      <w:proofErr w:type="spellStart"/>
       <w:r>
         <w:t>llava</w:t>
       </w:r>
-      <w:proofErr w:type="spellEnd"/>
       <w:r>
         <w:rPr>
           <w:lang w:val="ru-RU"/>
@@ -7379,11 +7167,9 @@
         </w:rPr>
         <w:t xml:space="preserve"> уже использует </w:t>
       </w:r>
-      <w:proofErr w:type="spellStart"/>
       <w:r>
         <w:t>LoRA</w:t>
       </w:r>
-      <w:proofErr w:type="spellEnd"/>
       <w:r>
         <w:rPr>
           <w:lang w:val="ru-RU"/>
@@ -7420,11 +7206,9 @@
         </w:rPr>
         <w:t xml:space="preserve">Модель </w:t>
       </w:r>
-      <w:proofErr w:type="spellStart"/>
       <w:r>
         <w:t>LlavaForConditionalGeneration</w:t>
       </w:r>
-      <w:proofErr w:type="spellEnd"/>
       <w:r>
         <w:rPr>
           <w:lang w:val="ru-RU"/>
@@ -7456,11 +7240,9 @@
         </w:rPr>
         <w:t xml:space="preserve"> (</w:t>
       </w:r>
-      <w:proofErr w:type="spellStart"/>
       <w:r>
         <w:t>SigLIP</w:t>
       </w:r>
-      <w:proofErr w:type="spellEnd"/>
       <w:r>
         <w:rPr>
           <w:lang w:val="ru-RU"/>
@@ -7589,11 +7371,9 @@
         </w:rPr>
         <w:t xml:space="preserve">4), </w:t>
       </w:r>
-      <w:proofErr w:type="spellStart"/>
       <w:r>
         <w:t>LoRA</w:t>
       </w:r>
-      <w:proofErr w:type="spellEnd"/>
       <w:r>
         <w:rPr>
           <w:lang w:val="ru-RU"/>
@@ -7610,31 +7390,9 @@
         <w:rPr>
           <w:color w:val="007BFF"/>
         </w:rPr>
-        <w:t xml:space="preserve">5.3. </w:t>
-      </w:r>
-      <w:proofErr w:type="spellStart"/>
-      <w:r>
-        <w:rPr>
-          <w:color w:val="007BFF"/>
-        </w:rPr>
-        <w:t>Конфигурация</w:t>
-      </w:r>
-      <w:proofErr w:type="spellEnd"/>
-      <w:r>
-        <w:rPr>
-          <w:color w:val="007BFF"/>
-        </w:rPr>
-        <w:t xml:space="preserve"> </w:t>
-      </w:r>
-      <w:proofErr w:type="spellStart"/>
-      <w:r>
-        <w:rPr>
-          <w:color w:val="007BFF"/>
-        </w:rPr>
-        <w:t>обучения</w:t>
+        <w:t>5.3. Конфигурация обучения</w:t>
       </w:r>
       <w:bookmarkEnd w:id="17"/>
-      <w:proofErr w:type="spellEnd"/>
     </w:p>
     <w:tbl>
       <w:tblPr>
@@ -7784,16 +7542,8 @@
               <w:rPr>
                 <w:sz w:val="20"/>
               </w:rPr>
-              <w:t xml:space="preserve">Compute </w:t>
-            </w:r>
-            <w:proofErr w:type="spellStart"/>
-            <w:r>
-              <w:rPr>
-                <w:sz w:val="20"/>
-              </w:rPr>
-              <w:t>dtype</w:t>
-            </w:r>
-            <w:proofErr w:type="spellEnd"/>
+              <w:t>Compute dtype</w:t>
+            </w:r>
           </w:p>
         </w:tc>
         <w:tc>
@@ -8707,14 +8457,12 @@
               </w:rPr>
               <w:t xml:space="preserve"> + </w:t>
             </w:r>
-            <w:proofErr w:type="spellStart"/>
             <w:r>
               <w:rPr>
                 <w:sz w:val="20"/>
               </w:rPr>
               <w:t>MMBench</w:t>
             </w:r>
-            <w:proofErr w:type="spellEnd"/>
             <w:r>
               <w:rPr>
                 <w:sz w:val="20"/>
@@ -8887,55 +8635,7 @@
       </w:r>
       <w:r>
         <w:br/>
-        <w:t xml:space="preserve">3. evaluate.py → </w:t>
-      </w:r>
-      <w:proofErr w:type="spellStart"/>
-      <w:r>
-        <w:t>eval_results</w:t>
-      </w:r>
-      <w:proofErr w:type="spellEnd"/>
-      <w:r>
-        <w:t>/{</w:t>
-      </w:r>
-      <w:proofErr w:type="spellStart"/>
-      <w:proofErr w:type="gramStart"/>
-      <w:r>
-        <w:t>base,finetuned</w:t>
-      </w:r>
-      <w:proofErr w:type="spellEnd"/>
-      <w:proofErr w:type="gramEnd"/>
-      <w:r>
-        <w:t>}_{</w:t>
-      </w:r>
-      <w:proofErr w:type="spellStart"/>
-      <w:proofErr w:type="gramStart"/>
-      <w:r>
-        <w:t>gqa,mmbench</w:t>
-      </w:r>
-      <w:proofErr w:type="spellEnd"/>
-      <w:proofErr w:type="gramEnd"/>
-      <w:r>
-        <w:t>}_</w:t>
-      </w:r>
-      <w:proofErr w:type="spellStart"/>
-      <w:proofErr w:type="gramStart"/>
-      <w:r>
-        <w:t>results.json</w:t>
-      </w:r>
-      <w:proofErr w:type="spellEnd"/>
-      <w:proofErr w:type="gramEnd"/>
-      <w:r>
-        <w:t xml:space="preserve"> + </w:t>
-      </w:r>
-      <w:proofErr w:type="spellStart"/>
-      <w:proofErr w:type="gramStart"/>
-      <w:r>
-        <w:t>summary.json</w:t>
-      </w:r>
-      <w:proofErr w:type="spellEnd"/>
-      <w:proofErr w:type="gramEnd"/>
-      <w:r>
-        <w:t xml:space="preserve"> </w:t>
+        <w:t xml:space="preserve">3. evaluate.py → eval_results/{base,finetuned}_{gqa,mmbench}_results.json + summary.json </w:t>
       </w:r>
     </w:p>
     <w:p>
@@ -8967,11 +8667,9 @@
         </w:rPr>
         <w:t xml:space="preserve"> очищается при запуске скриптов, чтобы избежать конфликта с </w:t>
       </w:r>
-      <w:proofErr w:type="spellStart"/>
       <w:r>
         <w:t>venv</w:t>
       </w:r>
-      <w:proofErr w:type="spellEnd"/>
       <w:r>
         <w:rPr>
           <w:lang w:val="ru-RU"/>
@@ -8986,21 +8684,8 @@
       <w:pPr>
         <w:pStyle w:val="a0"/>
       </w:pPr>
-      <w:proofErr w:type="spellStart"/>
-      <w:r>
-        <w:t>Загрузка</w:t>
-      </w:r>
-      <w:proofErr w:type="spellEnd"/>
-      <w:r>
-        <w:t xml:space="preserve"> </w:t>
-      </w:r>
-      <w:proofErr w:type="spellStart"/>
-      <w:r>
-        <w:t>модели</w:t>
-      </w:r>
-      <w:proofErr w:type="spellEnd"/>
-      <w:r>
-        <w:t xml:space="preserve"> в 4-bit через BitsAndBytesConfig (load_in_4bit=True, nf4, double_quant)</w:t>
+      <w:r>
+        <w:t>Загрузка модели в 4-bit через BitsAndBytesConfig (load_in_4bit=True, nf4, double_quant)</w:t>
       </w:r>
     </w:p>
     <w:p>
@@ -9010,18 +8695,15 @@
           <w:lang w:val="ru-RU"/>
         </w:rPr>
       </w:pPr>
-      <w:proofErr w:type="spellStart"/>
       <w:r>
         <w:t>LoRA</w:t>
       </w:r>
-      <w:proofErr w:type="spellEnd"/>
       <w:r>
         <w:rPr>
           <w:lang w:val="ru-RU"/>
         </w:rPr>
         <w:t xml:space="preserve"> применяется к </w:t>
       </w:r>
-      <w:proofErr w:type="gramStart"/>
       <w:r>
         <w:t>model</w:t>
       </w:r>
@@ -9034,7 +8716,6 @@
       <w:r>
         <w:t>language</w:t>
       </w:r>
-      <w:proofErr w:type="gramEnd"/>
       <w:r>
         <w:rPr>
           <w:lang w:val="ru-RU"/>
@@ -9068,11 +8749,9 @@
         </w:rPr>
         <w:t xml:space="preserve">), а не к полной </w:t>
       </w:r>
-      <w:proofErr w:type="spellStart"/>
       <w:r>
         <w:t>LLaVA</w:t>
       </w:r>
-      <w:proofErr w:type="spellEnd"/>
       <w:r>
         <w:rPr>
           <w:lang w:val="ru-RU"/>
@@ -9102,22 +8781,18 @@
         </w:rPr>
         <w:t>-</w:t>
       </w:r>
-      <w:proofErr w:type="spellStart"/>
       <w:r>
         <w:t>ru</w:t>
       </w:r>
-      <w:proofErr w:type="spellEnd"/>
       <w:r>
         <w:rPr>
           <w:lang w:val="ru-RU"/>
         </w:rPr>
         <w:t xml:space="preserve"> изображения загружаются из </w:t>
       </w:r>
-      <w:proofErr w:type="spellStart"/>
       <w:r>
         <w:t>testdev</w:t>
       </w:r>
-      <w:proofErr w:type="spellEnd"/>
       <w:r>
         <w:rPr>
           <w:lang w:val="ru-RU"/>
@@ -9151,11 +8826,9 @@
         </w:rPr>
         <w:t xml:space="preserve"> с </w:t>
       </w:r>
-      <w:proofErr w:type="spellStart"/>
       <w:r>
         <w:t>testdev</w:t>
       </w:r>
-      <w:proofErr w:type="spellEnd"/>
       <w:r>
         <w:rPr>
           <w:lang w:val="ru-RU"/>
@@ -9180,11 +8853,9 @@
         </w:rPr>
         <w:t xml:space="preserve"> по полю </w:t>
       </w:r>
-      <w:proofErr w:type="spellStart"/>
       <w:r>
         <w:t>imageId</w:t>
       </w:r>
-      <w:proofErr w:type="spellEnd"/>
       <w:r>
         <w:rPr>
           <w:lang w:val="ru-RU"/>
@@ -9340,37 +9011,8 @@
         </w:rPr>
         <w:t xml:space="preserve"> за всю тренировку: 6.34. </w:t>
       </w:r>
-      <w:proofErr w:type="spellStart"/>
-      <w:r>
-        <w:t>Кривая</w:t>
-      </w:r>
-      <w:proofErr w:type="spellEnd"/>
-      <w:r>
-        <w:t xml:space="preserve"> </w:t>
-      </w:r>
-      <w:proofErr w:type="spellStart"/>
-      <w:r>
-        <w:t>показывает</w:t>
-      </w:r>
-      <w:proofErr w:type="spellEnd"/>
-      <w:r>
-        <w:t xml:space="preserve"> </w:t>
-      </w:r>
-      <w:proofErr w:type="spellStart"/>
-      <w:r>
-        <w:t>здоровую</w:t>
-      </w:r>
-      <w:proofErr w:type="spellEnd"/>
-      <w:r>
-        <w:t xml:space="preserve"> </w:t>
-      </w:r>
-      <w:proofErr w:type="spellStart"/>
-      <w:r>
-        <w:t>сходимость</w:t>
-      </w:r>
-      <w:proofErr w:type="spellEnd"/>
-      <w:r>
-        <w:t xml:space="preserve"> без переобучения.</w:t>
+      <w:r>
+        <w:t>Кривая показывает здоровую сходимость без переобучения.</w:t>
       </w:r>
     </w:p>
     <w:p>
@@ -9779,11 +9421,9 @@
       </w:r>
     </w:p>
     <w:p>
-      <w:proofErr w:type="spellStart"/>
       <w:r>
         <w:t>QLoRA</w:t>
       </w:r>
-      <w:proofErr w:type="spellEnd"/>
       <w:r>
         <w:rPr>
           <w:lang w:val="ru-RU"/>
@@ -9900,11 +9540,9 @@
         </w:rPr>
         <w:t xml:space="preserve"> это </w:t>
       </w:r>
-      <w:proofErr w:type="spellStart"/>
       <w:r>
         <w:t>LoRA</w:t>
       </w:r>
-      <w:proofErr w:type="spellEnd"/>
       <w:r>
         <w:rPr>
           <w:lang w:val="ru-RU"/>
@@ -10240,22 +9878,18 @@
         </w:rPr>
         <w:t>-</w:t>
       </w:r>
-      <w:proofErr w:type="spellStart"/>
       <w:r>
         <w:t>ru</w:t>
       </w:r>
-      <w:proofErr w:type="spellEnd"/>
       <w:r>
         <w:rPr>
           <w:lang w:val="ru-RU"/>
         </w:rPr>
         <w:t xml:space="preserve"> оценивался на 100 примерах из </w:t>
       </w:r>
-      <w:proofErr w:type="spellStart"/>
       <w:r>
         <w:t>testdev</w:t>
       </w:r>
-      <w:proofErr w:type="spellEnd"/>
       <w:r>
         <w:rPr>
           <w:lang w:val="ru-RU"/>
@@ -10271,11 +9905,9 @@
         </w:rPr>
         <w:t xml:space="preserve"> изображений из </w:t>
       </w:r>
-      <w:proofErr w:type="spellStart"/>
       <w:r>
         <w:t>testdev</w:t>
       </w:r>
-      <w:proofErr w:type="spellEnd"/>
       <w:r>
         <w:rPr>
           <w:lang w:val="ru-RU"/>
@@ -10411,14 +10043,12 @@
         </w:rPr>
         <w:t xml:space="preserve">8.3. Оценка </w:t>
       </w:r>
-      <w:proofErr w:type="spellStart"/>
       <w:r>
         <w:rPr>
           <w:color w:val="007BFF"/>
         </w:rPr>
         <w:t>MMBench</w:t>
       </w:r>
-      <w:proofErr w:type="spellEnd"/>
       <w:r>
         <w:rPr>
           <w:color w:val="007BFF"/>
@@ -10426,7 +10056,6 @@
         </w:rPr>
         <w:t>-</w:t>
       </w:r>
-      <w:proofErr w:type="spellStart"/>
       <w:r>
         <w:rPr>
           <w:color w:val="007BFF"/>
@@ -10434,7 +10063,6 @@
         <w:t>ru</w:t>
       </w:r>
       <w:bookmarkEnd w:id="30"/>
-      <w:proofErr w:type="spellEnd"/>
     </w:p>
     <w:p>
       <w:pPr>
@@ -10442,22 +10070,18 @@
           <w:lang w:val="ru-RU"/>
         </w:rPr>
       </w:pPr>
-      <w:proofErr w:type="spellStart"/>
       <w:r>
         <w:t>MMBench</w:t>
       </w:r>
-      <w:proofErr w:type="spellEnd"/>
       <w:r>
         <w:rPr>
           <w:lang w:val="ru-RU"/>
         </w:rPr>
         <w:t>-</w:t>
       </w:r>
-      <w:proofErr w:type="spellStart"/>
       <w:r>
         <w:t>ru</w:t>
       </w:r>
-      <w:proofErr w:type="spellEnd"/>
       <w:r>
         <w:rPr>
           <w:lang w:val="ru-RU"/>
@@ -10607,7 +10231,6 @@
         </w:rPr>
         <w:t>-</w:t>
       </w:r>
-      <w:proofErr w:type="spellStart"/>
       <w:r>
         <w:rPr>
           <w:color w:val="007BFF"/>
@@ -10615,7 +10238,6 @@
         <w:t>ru</w:t>
       </w:r>
       <w:bookmarkEnd w:id="31"/>
-      <w:proofErr w:type="spellEnd"/>
     </w:p>
     <w:p>
       <w:r>
@@ -10680,11 +10302,9 @@
         </w:rPr>
         <w:t>-</w:t>
       </w:r>
-      <w:proofErr w:type="spellStart"/>
       <w:r>
         <w:t>ru</w:t>
       </w:r>
-      <w:proofErr w:type="spellEnd"/>
       <w:r>
         <w:rPr>
           <w:lang w:val="ru-RU"/>
@@ -10813,11 +10433,9 @@
         </w:rPr>
         <w:t>-</w:t>
       </w:r>
-      <w:proofErr w:type="spellStart"/>
       <w:r>
         <w:t>ru</w:t>
       </w:r>
-      <w:proofErr w:type="spellEnd"/>
       <w:r>
         <w:rPr>
           <w:lang w:val="ru-RU"/>
@@ -10885,11 +10503,9 @@
         </w:rPr>
         <w:t xml:space="preserve">Результаты показывают, что </w:t>
       </w:r>
-      <w:proofErr w:type="spellStart"/>
       <w:r>
         <w:t>QLoRA</w:t>
       </w:r>
-      <w:proofErr w:type="spellEnd"/>
       <w:r>
         <w:rPr>
           <w:lang w:val="ru-RU"/>
@@ -10923,11 +10539,9 @@
         </w:rPr>
         <w:t>-</w:t>
       </w:r>
-      <w:proofErr w:type="spellStart"/>
       <w:r>
         <w:t>ru</w:t>
       </w:r>
-      <w:proofErr w:type="spellEnd"/>
       <w:r>
         <w:rPr>
           <w:lang w:val="ru-RU"/>
@@ -10942,22 +10556,18 @@
           <w:lang w:val="ru-RU"/>
         </w:rPr>
       </w:pPr>
-      <w:proofErr w:type="spellStart"/>
       <w:r>
         <w:t>MMBench</w:t>
       </w:r>
-      <w:proofErr w:type="spellEnd"/>
       <w:r>
         <w:rPr>
           <w:lang w:val="ru-RU"/>
         </w:rPr>
         <w:t>-</w:t>
       </w:r>
-      <w:proofErr w:type="spellStart"/>
       <w:r>
         <w:t>ru</w:t>
       </w:r>
-      <w:proofErr w:type="spellEnd"/>
       <w:r>
         <w:rPr>
           <w:lang w:val="ru-RU"/>
@@ -11029,11 +10639,9 @@
         </w:rPr>
         <w:t>-</w:t>
       </w:r>
-      <w:proofErr w:type="spellStart"/>
       <w:r>
         <w:t>ru</w:t>
       </w:r>
-      <w:proofErr w:type="spellEnd"/>
       <w:r>
         <w:rPr>
           <w:lang w:val="ru-RU"/>
@@ -11101,11 +10709,9 @@
         </w:rPr>
         <w:t>-</w:t>
       </w:r>
-      <w:proofErr w:type="spellStart"/>
       <w:r>
         <w:t>ru</w:t>
       </w:r>
-      <w:proofErr w:type="spellEnd"/>
     </w:p>
     <w:p>
       <w:pPr>
@@ -11171,11 +10777,9 @@
         </w:rPr>
         <w:t>-</w:t>
       </w:r>
-      <w:proofErr w:type="spellStart"/>
       <w:r>
         <w:t>ru</w:t>
       </w:r>
-      <w:proofErr w:type="spellEnd"/>
       <w:r>
         <w:rPr>
           <w:lang w:val="ru-RU"/>
@@ -11287,11 +10891,9 @@
         </w:rPr>
         <w:t>Модель уже была адаптирована для русского языка (</w:t>
       </w:r>
-      <w:proofErr w:type="spellStart"/>
       <w:r>
         <w:t>llava</w:t>
       </w:r>
-      <w:proofErr w:type="spellEnd"/>
       <w:r>
         <w:rPr>
           <w:lang w:val="ru-RU"/>
@@ -11335,45 +10937,9 @@
         <w:rPr>
           <w:color w:val="007BFF"/>
         </w:rPr>
-        <w:t xml:space="preserve">9.3. </w:t>
-      </w:r>
-      <w:proofErr w:type="spellStart"/>
-      <w:r>
-        <w:rPr>
-          <w:color w:val="007BFF"/>
-        </w:rPr>
-        <w:t>Что</w:t>
-      </w:r>
-      <w:proofErr w:type="spellEnd"/>
-      <w:r>
-        <w:rPr>
-          <w:color w:val="007BFF"/>
-        </w:rPr>
-        <w:t xml:space="preserve"> </w:t>
-      </w:r>
-      <w:proofErr w:type="spellStart"/>
-      <w:r>
-        <w:rPr>
-          <w:color w:val="007BFF"/>
-        </w:rPr>
-        <w:t>было</w:t>
-      </w:r>
-      <w:proofErr w:type="spellEnd"/>
-      <w:r>
-        <w:rPr>
-          <w:color w:val="007BFF"/>
-        </w:rPr>
-        <w:t xml:space="preserve"> </w:t>
-      </w:r>
-      <w:proofErr w:type="spellStart"/>
-      <w:r>
-        <w:rPr>
-          <w:color w:val="007BFF"/>
-        </w:rPr>
-        <w:t>достигнуто</w:t>
+        <w:t>9.3. Что было достигнуто</w:t>
       </w:r>
       <w:bookmarkEnd w:id="36"/>
-      <w:proofErr w:type="spellEnd"/>
     </w:p>
     <w:p>
       <w:pPr>
@@ -11386,21 +10952,7 @@
         <w:rPr>
           <w:lang w:val="ru-RU"/>
         </w:rPr>
-        <w:t xml:space="preserve">Полностью воспроизводимый </w:t>
-      </w:r>
-      <w:proofErr w:type="spellStart"/>
-      <w:r>
-        <w:rPr>
-          <w:lang w:val="ru-RU"/>
-        </w:rPr>
-        <w:t>пайплайн</w:t>
-      </w:r>
-      <w:proofErr w:type="spellEnd"/>
-      <w:r>
-        <w:rPr>
-          <w:lang w:val="ru-RU"/>
-        </w:rPr>
-        <w:t xml:space="preserve"> от </w:t>
+        <w:t xml:space="preserve">Полностью воспроизводимый пайплайн от </w:t>
       </w:r>
       <w:r>
         <w:t>EDA</w:t>
@@ -11443,11 +10995,9 @@
         </w:rPr>
         <w:t xml:space="preserve">Успешное </w:t>
       </w:r>
-      <w:proofErr w:type="spellStart"/>
       <w:r>
         <w:t>QLoRA</w:t>
       </w:r>
-      <w:proofErr w:type="spellEnd"/>
       <w:r>
         <w:rPr>
           <w:lang w:val="ru-RU"/>
@@ -11631,45 +11181,9 @@
           <w:color w:val="007BFF"/>
         </w:rPr>
         <w:lastRenderedPageBreak/>
-        <w:t xml:space="preserve">10. </w:t>
-      </w:r>
-      <w:proofErr w:type="spellStart"/>
-      <w:r>
-        <w:rPr>
-          <w:color w:val="007BFF"/>
-        </w:rPr>
-        <w:t>Выводы</w:t>
-      </w:r>
-      <w:proofErr w:type="spellEnd"/>
-      <w:r>
-        <w:rPr>
-          <w:color w:val="007BFF"/>
-        </w:rPr>
-        <w:t xml:space="preserve"> и </w:t>
-      </w:r>
-      <w:proofErr w:type="spellStart"/>
-      <w:r>
-        <w:rPr>
-          <w:color w:val="007BFF"/>
-        </w:rPr>
-        <w:t>направления</w:t>
-      </w:r>
-      <w:proofErr w:type="spellEnd"/>
-      <w:r>
-        <w:rPr>
-          <w:color w:val="007BFF"/>
-        </w:rPr>
-        <w:t xml:space="preserve"> </w:t>
-      </w:r>
-      <w:proofErr w:type="spellStart"/>
-      <w:r>
-        <w:rPr>
-          <w:color w:val="007BFF"/>
-        </w:rPr>
-        <w:t>развития</w:t>
+        <w:t>10. Выводы и направления развития</w:t>
       </w:r>
       <w:bookmarkEnd w:id="37"/>
-      <w:proofErr w:type="spellEnd"/>
     </w:p>
     <w:p>
       <w:pPr>
@@ -11697,11 +11211,9 @@
         </w:rPr>
         <w:t xml:space="preserve">Проект демонстрирует возможность </w:t>
       </w:r>
-      <w:proofErr w:type="spellStart"/>
       <w:r>
         <w:t>QLoRA</w:t>
       </w:r>
-      <w:proofErr w:type="spellEnd"/>
       <w:r>
         <w:rPr>
           <w:lang w:val="ru-RU"/>
@@ -11794,11 +11306,9 @@
         </w:rPr>
         <w:t xml:space="preserve">4) + </w:t>
       </w:r>
-      <w:proofErr w:type="spellStart"/>
       <w:r>
         <w:t>LoRA</w:t>
       </w:r>
-      <w:proofErr w:type="spellEnd"/>
       <w:r>
         <w:rPr>
           <w:lang w:val="ru-RU"/>
@@ -11831,11 +11341,9 @@
         </w:rPr>
         <w:t xml:space="preserve">Текстовый </w:t>
       </w:r>
-      <w:proofErr w:type="spellStart"/>
       <w:r>
         <w:t>QLoRA</w:t>
       </w:r>
-      <w:proofErr w:type="spellEnd"/>
       <w:r>
         <w:rPr>
           <w:lang w:val="ru-RU"/>
@@ -11860,22 +11368,18 @@
         </w:rPr>
         <w:t xml:space="preserve"> сохраняет визуально-языковые способности модели (</w:t>
       </w:r>
-      <w:proofErr w:type="spellStart"/>
       <w:r>
         <w:t>MMBench</w:t>
       </w:r>
-      <w:proofErr w:type="spellEnd"/>
       <w:r>
         <w:rPr>
           <w:lang w:val="ru-RU"/>
         </w:rPr>
         <w:t>-</w:t>
       </w:r>
-      <w:proofErr w:type="spellStart"/>
       <w:r>
         <w:t>ru</w:t>
       </w:r>
-      <w:proofErr w:type="spellEnd"/>
       <w:r>
         <w:rPr>
           <w:lang w:val="ru-RU"/>
@@ -11977,31 +11481,9 @@
         <w:rPr>
           <w:color w:val="007BFF"/>
         </w:rPr>
-        <w:t xml:space="preserve">10.2. </w:t>
-      </w:r>
-      <w:proofErr w:type="spellStart"/>
-      <w:r>
-        <w:rPr>
-          <w:color w:val="007BFF"/>
-        </w:rPr>
-        <w:t>Направления</w:t>
-      </w:r>
-      <w:proofErr w:type="spellEnd"/>
-      <w:r>
-        <w:rPr>
-          <w:color w:val="007BFF"/>
-        </w:rPr>
-        <w:t xml:space="preserve"> </w:t>
-      </w:r>
-      <w:proofErr w:type="spellStart"/>
-      <w:r>
-        <w:rPr>
-          <w:color w:val="007BFF"/>
-        </w:rPr>
-        <w:t>развития</w:t>
+        <w:t>10.2. Направления развития</w:t>
       </w:r>
       <w:bookmarkEnd w:id="39"/>
-      <w:proofErr w:type="spellEnd"/>
     </w:p>
     <w:tbl>
       <w:tblPr>
@@ -12150,28 +11632,12 @@
             <w:tcW w:w="4320" w:type="dxa"/>
           </w:tcPr>
           <w:p>
-            <w:proofErr w:type="spellStart"/>
-            <w:r>
-              <w:rPr>
-                <w:sz w:val="20"/>
-              </w:rPr>
-              <w:t>Больше</w:t>
-            </w:r>
-            <w:proofErr w:type="spellEnd"/>
-            <w:r>
-              <w:rPr>
-                <w:sz w:val="20"/>
-              </w:rPr>
-              <w:t xml:space="preserve"> </w:t>
-            </w:r>
-            <w:proofErr w:type="spellStart"/>
-            <w:r>
-              <w:rPr>
-                <w:sz w:val="20"/>
-              </w:rPr>
-              <w:t>шагов</w:t>
-            </w:r>
-            <w:proofErr w:type="spellEnd"/>
+            <w:r>
+              <w:rPr>
+                <w:sz w:val="20"/>
+              </w:rPr>
+              <w:t>Больше шагов</w:t>
+            </w:r>
           </w:p>
         </w:tc>
         <w:tc>
@@ -12216,23 +11682,7 @@
                 <w:sz w:val="20"/>
                 <w:lang w:val="ru-RU"/>
               </w:rPr>
-              <w:t xml:space="preserve"> с 100 до </w:t>
-            </w:r>
-            <w:proofErr w:type="gramStart"/>
-            <w:r>
-              <w:rPr>
-                <w:sz w:val="20"/>
-                <w:lang w:val="ru-RU"/>
-              </w:rPr>
-              <w:t>500-1000</w:t>
-            </w:r>
-            <w:proofErr w:type="gramEnd"/>
-            <w:r>
-              <w:rPr>
-                <w:sz w:val="20"/>
-                <w:lang w:val="ru-RU"/>
-              </w:rPr>
-              <w:t xml:space="preserve"> для полной сходимости</w:t>
+              <w:t xml:space="preserve"> с 100 до 500-1000 для полной сходимости</w:t>
             </w:r>
           </w:p>
         </w:tc>
@@ -12248,28 +11698,12 @@
             <w:tcW w:w="4320" w:type="dxa"/>
           </w:tcPr>
           <w:p>
-            <w:proofErr w:type="spellStart"/>
-            <w:r>
-              <w:rPr>
-                <w:sz w:val="20"/>
-              </w:rPr>
-              <w:t>LLaVA</w:t>
-            </w:r>
-            <w:proofErr w:type="spellEnd"/>
-            <w:r>
-              <w:rPr>
-                <w:sz w:val="20"/>
-              </w:rPr>
-              <w:t>-Instruct-</w:t>
-            </w:r>
-            <w:proofErr w:type="spellStart"/>
-            <w:r>
-              <w:rPr>
-                <w:sz w:val="20"/>
-              </w:rPr>
-              <w:t>ru</w:t>
-            </w:r>
-            <w:proofErr w:type="spellEnd"/>
+            <w:r>
+              <w:rPr>
+                <w:sz w:val="20"/>
+              </w:rPr>
+              <w:t>LLaVA-Instruct-ru</w:t>
+            </w:r>
           </w:p>
         </w:tc>
         <w:tc>
@@ -12379,14 +11813,12 @@
               </w:rPr>
               <w:t xml:space="preserve">Оптимизация промптов для </w:t>
             </w:r>
-            <w:proofErr w:type="spellStart"/>
             <w:r>
               <w:rPr>
                 <w:sz w:val="20"/>
               </w:rPr>
               <w:t>MMBench</w:t>
             </w:r>
-            <w:proofErr w:type="spellEnd"/>
             <w:r>
               <w:rPr>
                 <w:sz w:val="20"/>
@@ -12394,14 +11826,12 @@
               </w:rPr>
               <w:t>-</w:t>
             </w:r>
-            <w:proofErr w:type="spellStart"/>
             <w:r>
               <w:rPr>
                 <w:sz w:val="20"/>
               </w:rPr>
               <w:t>ru</w:t>
             </w:r>
-            <w:proofErr w:type="spellEnd"/>
             <w:r>
               <w:rPr>
                 <w:sz w:val="20"/>
@@ -12423,28 +11853,12 @@
             <w:tcW w:w="4320" w:type="dxa"/>
           </w:tcPr>
           <w:p>
-            <w:proofErr w:type="spellStart"/>
-            <w:r>
-              <w:rPr>
-                <w:sz w:val="20"/>
-              </w:rPr>
-              <w:t>Полная</w:t>
-            </w:r>
-            <w:proofErr w:type="spellEnd"/>
-            <w:r>
-              <w:rPr>
-                <w:sz w:val="20"/>
-              </w:rPr>
-              <w:t xml:space="preserve"> </w:t>
-            </w:r>
-            <w:proofErr w:type="spellStart"/>
-            <w:r>
-              <w:rPr>
-                <w:sz w:val="20"/>
-              </w:rPr>
-              <w:t>оценка</w:t>
-            </w:r>
-            <w:proofErr w:type="spellEnd"/>
+            <w:r>
+              <w:rPr>
+                <w:sz w:val="20"/>
+              </w:rPr>
+              <w:t>Полная оценка</w:t>
+            </w:r>
           </w:p>
         </w:tc>
         <w:tc>
@@ -12465,14 +11879,12 @@
               </w:rPr>
               <w:t xml:space="preserve">Оценка на полном </w:t>
             </w:r>
-            <w:proofErr w:type="spellStart"/>
             <w:r>
               <w:rPr>
                 <w:sz w:val="20"/>
               </w:rPr>
               <w:t>testdev</w:t>
             </w:r>
-            <w:proofErr w:type="spellEnd"/>
             <w:r>
               <w:rPr>
                 <w:sz w:val="20"/>
@@ -12626,14 +12038,12 @@
             <w:tcW w:w="4320" w:type="dxa"/>
           </w:tcPr>
           <w:p>
-            <w:proofErr w:type="spellStart"/>
             <w:r>
               <w:rPr>
                 <w:sz w:val="20"/>
               </w:rPr>
               <w:t>Файл</w:t>
             </w:r>
-            <w:proofErr w:type="spellEnd"/>
           </w:p>
         </w:tc>
         <w:tc>
@@ -13112,14 +12522,12 @@
               </w:rPr>
               <w:t>-</w:t>
             </w:r>
-            <w:proofErr w:type="spellStart"/>
             <w:r>
               <w:rPr>
                 <w:sz w:val="20"/>
               </w:rPr>
               <w:t>ru</w:t>
             </w:r>
-            <w:proofErr w:type="spellEnd"/>
           </w:p>
         </w:tc>
       </w:tr>
@@ -13134,28 +12542,12 @@
             <w:tcW w:w="4320" w:type="dxa"/>
           </w:tcPr>
           <w:p>
-            <w:proofErr w:type="spellStart"/>
-            <w:r>
-              <w:rPr>
-                <w:sz w:val="20"/>
-              </w:rPr>
-              <w:t>eval_results</w:t>
-            </w:r>
-            <w:proofErr w:type="spellEnd"/>
-            <w:r>
-              <w:rPr>
-                <w:sz w:val="20"/>
-              </w:rPr>
-              <w:t>/</w:t>
-            </w:r>
-            <w:proofErr w:type="spellStart"/>
-            <w:r>
-              <w:rPr>
-                <w:sz w:val="20"/>
-              </w:rPr>
-              <w:t>finetuned_gqa_results.json</w:t>
-            </w:r>
-            <w:proofErr w:type="spellEnd"/>
+            <w:r>
+              <w:rPr>
+                <w:sz w:val="20"/>
+              </w:rPr>
+              <w:t>eval_results/finetuned_gqa_results.json</w:t>
+            </w:r>
           </w:p>
         </w:tc>
         <w:tc>
@@ -13215,14 +12607,12 @@
               </w:rPr>
               <w:t>-</w:t>
             </w:r>
-            <w:proofErr w:type="spellStart"/>
             <w:r>
               <w:rPr>
                 <w:sz w:val="20"/>
               </w:rPr>
               <w:t>ru</w:t>
             </w:r>
-            <w:proofErr w:type="spellEnd"/>
           </w:p>
         </w:tc>
       </w:tr>
@@ -13237,28 +12627,12 @@
             <w:tcW w:w="4320" w:type="dxa"/>
           </w:tcPr>
           <w:p>
-            <w:proofErr w:type="spellStart"/>
-            <w:r>
-              <w:rPr>
-                <w:sz w:val="20"/>
-              </w:rPr>
-              <w:t>eval_results</w:t>
-            </w:r>
-            <w:proofErr w:type="spellEnd"/>
-            <w:r>
-              <w:rPr>
-                <w:sz w:val="20"/>
-              </w:rPr>
-              <w:t>/</w:t>
-            </w:r>
-            <w:proofErr w:type="spellStart"/>
-            <w:r>
-              <w:rPr>
-                <w:sz w:val="20"/>
-              </w:rPr>
-              <w:t>base_mmbench_results.json</w:t>
-            </w:r>
-            <w:proofErr w:type="spellEnd"/>
+            <w:r>
+              <w:rPr>
+                <w:sz w:val="20"/>
+              </w:rPr>
+              <w:t>eval_results/base_mmbench_results.json</w:t>
+            </w:r>
           </w:p>
         </w:tc>
         <w:tc>
@@ -13292,14 +12666,12 @@
               </w:rPr>
               <w:t xml:space="preserve"> на </w:t>
             </w:r>
-            <w:proofErr w:type="spellStart"/>
             <w:r>
               <w:rPr>
                 <w:sz w:val="20"/>
               </w:rPr>
               <w:t>MMBench</w:t>
             </w:r>
-            <w:proofErr w:type="spellEnd"/>
             <w:r>
               <w:rPr>
                 <w:sz w:val="20"/>
@@ -13307,14 +12679,12 @@
               </w:rPr>
               <w:t>-</w:t>
             </w:r>
-            <w:proofErr w:type="spellStart"/>
             <w:r>
               <w:rPr>
                 <w:sz w:val="20"/>
               </w:rPr>
               <w:t>ru</w:t>
             </w:r>
-            <w:proofErr w:type="spellEnd"/>
           </w:p>
         </w:tc>
       </w:tr>
@@ -13329,28 +12699,12 @@
             <w:tcW w:w="4320" w:type="dxa"/>
           </w:tcPr>
           <w:p>
-            <w:proofErr w:type="spellStart"/>
-            <w:r>
-              <w:rPr>
-                <w:sz w:val="20"/>
-              </w:rPr>
-              <w:t>eval_results</w:t>
-            </w:r>
-            <w:proofErr w:type="spellEnd"/>
-            <w:r>
-              <w:rPr>
-                <w:sz w:val="20"/>
-              </w:rPr>
-              <w:t>/</w:t>
-            </w:r>
-            <w:proofErr w:type="spellStart"/>
-            <w:r>
-              <w:rPr>
-                <w:sz w:val="20"/>
-              </w:rPr>
-              <w:t>finetuned_mmbench_results.json</w:t>
-            </w:r>
-            <w:proofErr w:type="spellEnd"/>
+            <w:r>
+              <w:rPr>
+                <w:sz w:val="20"/>
+              </w:rPr>
+              <w:t>eval_results/finetuned_mmbench_results.json</w:t>
+            </w:r>
           </w:p>
         </w:tc>
         <w:tc>
@@ -13397,14 +12751,12 @@
               </w:rPr>
               <w:t xml:space="preserve"> на </w:t>
             </w:r>
-            <w:proofErr w:type="spellStart"/>
             <w:r>
               <w:rPr>
                 <w:sz w:val="20"/>
               </w:rPr>
               <w:t>MMBench</w:t>
             </w:r>
-            <w:proofErr w:type="spellEnd"/>
             <w:r>
               <w:rPr>
                 <w:sz w:val="20"/>
@@ -13412,14 +12764,12 @@
               </w:rPr>
               <w:t>-</w:t>
             </w:r>
-            <w:proofErr w:type="spellStart"/>
             <w:r>
               <w:rPr>
                 <w:sz w:val="20"/>
               </w:rPr>
               <w:t>ru</w:t>
             </w:r>
-            <w:proofErr w:type="spellEnd"/>
           </w:p>
         </w:tc>
       </w:tr>

</xml_diff>